<commit_message>
Add live dashboard link; update report for standardised NPT % definition
</commit_message>
<xml_diff>
--- a/docs/Volve_NPT_Project_Report.docx
+++ b/docs/Volve_NPT_Project_Report.docx
@@ -135,6 +135,31 @@
           <w:szCs w:val="21"/>
         </w:rPr>
         <w:t xml:space="preserve">github.com/utkarshraj94/volve-npt-analysis</w:t>
+      </w:r>
+    </w:p>
+    <w:p>
+      <w:pPr>
+        <w:spacing w:after="60" w:line="288"/>
+      </w:pPr>
+      <w:r>
+        <w:rPr>
+          <w:rFonts w:ascii="Arial" w:cs="Arial" w:eastAsia="Arial" w:hAnsi="Arial"/>
+          <w:b/>
+          <w:bCs/>
+          <w:color w:val="1B2A33"/>
+          <w:sz w:val="21"/>
+          <w:szCs w:val="21"/>
+        </w:rPr>
+        <w:t xml:space="preserve">Live dashboard:  </w:t>
+      </w:r>
+      <w:r>
+        <w:rPr>
+          <w:rFonts w:ascii="Arial" w:cs="Arial" w:eastAsia="Arial" w:hAnsi="Arial"/>
+          <w:color w:val="1B2A33"/>
+          <w:sz w:val="21"/>
+          <w:szCs w:val="21"/>
+        </w:rPr>
+        <w:t xml:space="preserve">https://utkarshraj94.github.io/volve-npt-analysis/dashboard/</w:t>
       </w:r>
     </w:p>
     <w:p>
@@ -4481,7 +4506,7 @@
                 <w:sz w:val="21"/>
                 <w:szCs w:val="21"/>
               </w:rPr>
-              <w:t xml:space="preserve">Throughout this report, NPT % = NPT hours divided by total logged hours (including rig-move time in the denominator). This matches the 20.0% headline and the Power BI measure. The SQL view v_npt_by_wellbore uses a slightly different denominator (it excludes rig moves), which gives 20.5% field-wide. See Section 7.</w:t>
+              <w:t xml:space="preserve">Throughout this report, NPT % = NPT hours divided by total logged hours (including rig-move time in the denominator). This matches the 20.0% headline, the Power BI measure, the web dashboard and the SQL views. The views originally excluded rig moves from the denominator (20.5% field-wide); they were standardised on total hours in a later change (see Section 7).</w:t>
             </w:r>
           </w:p>
         </w:tc>
@@ -14892,6 +14917,40 @@
           <w:sz w:val="21"/>
           <w:szCs w:val="21"/>
         </w:rPr>
+        <w:t xml:space="preserve">A free, interactive web version of the same five pages is hosted on GitHub Pages: </w:t>
+      </w:r>
+      <w:r>
+        <w:rPr>
+          <w:rFonts w:ascii="Arial" w:cs="Arial" w:eastAsia="Arial" w:hAnsi="Arial"/>
+          <w:b/>
+          <w:bCs/>
+          <w:color w:val="2E86AB"/>
+          <w:sz w:val="21"/>
+          <w:szCs w:val="21"/>
+        </w:rPr>
+        <w:t xml:space="preserve">https://utkarshraj94.github.io/volve-npt-analysis/dashboard/</w:t>
+      </w:r>
+      <w:r>
+        <w:rPr>
+          <w:rFonts w:ascii="Arial" w:cs="Arial" w:eastAsia="Arial" w:hAnsi="Arial"/>
+          <w:color w:val="1B2A33"/>
+          <w:sz w:val="21"/>
+          <w:szCs w:val="21"/>
+        </w:rPr>
+        <w:t xml:space="preserve">. It reads a small JSON file of aggregated figures exported from the database (no drilling-report text) and works in any browser.</w:t>
+      </w:r>
+    </w:p>
+    <w:p>
+      <w:pPr>
+        <w:spacing w:after="120" w:line="288"/>
+      </w:pPr>
+      <w:r>
+        <w:rPr>
+          <w:rFonts w:ascii="Arial" w:cs="Arial" w:eastAsia="Arial" w:hAnsi="Arial"/>
+          <w:color w:val="1B2A33"/>
+          <w:sz w:val="21"/>
+          <w:szCs w:val="21"/>
+        </w:rPr>
         <w:t xml:space="preserve">Tooltips use Power BI’s sentence format so a hover reads as a plain sentence, for example “Wellbore F-12 ran at 17.9% NPT and produced 28.8M bbl”. The .pbix file embeds the imported data, so it opens anywhere, but Refresh only works on a machine that can reach the local PostgreSQL server.</w:t>
       </w:r>
     </w:p>
@@ -14982,7 +15041,7 @@
           <w:sz w:val="21"/>
           <w:szCs w:val="21"/>
         </w:rPr>
-        <w:t xml:space="preserve">Two NPT % definitions exist. </w:t>
+        <w:t xml:space="preserve">NPT % definition was standardised late. </w:t>
       </w:r>
       <w:r>
         <w:rPr>
@@ -14991,7 +15050,7 @@
           <w:sz w:val="21"/>
           <w:szCs w:val="21"/>
         </w:rPr>
-        <w:t xml:space="preserve">The report and Power BI divide by total logged hours (20.0% field-wide). The SQL view v_npt_by_wellbore divides by hours excluding rig moves (20.5% field-wide), which is why some earlier figures (for example 19-A at 41.0% and F-14 at 13.3%) are slightly higher than those here (38.4% and 13.0%). Standardising the view on one definition is a pending clean-up.</w:t>
+        <w:t xml:space="preserve">NPT % is NPT hours divided by total logged hours everywhere now (20.0% field-wide). Earlier, the SQL view v_npt_by_wellbore divided by hours excluding rig moves (20.5%), which is why figures quoted before the change (for example 19-A at 41.0% and F-14 at 13.3%) are slightly higher than those in this report (38.4% and 13.0%). The views, queries and dashboard export were updated to match, and the value was checked after the database was rebuilt.</w:t>
       </w:r>
     </w:p>
     <w:p>
@@ -15526,7 +15585,7 @@
           <w:sz w:val="21"/>
           <w:szCs w:val="21"/>
         </w:rPr>
-        <w:t xml:space="preserve">Standardise the NPT % definition in the SQL views and document the choice.</w:t>
+        <w:t xml:space="preserve">Source or replace the $12,500 rate, and show cost as a range (low / base / high).</w:t>
       </w:r>
     </w:p>
     <w:p>
@@ -15545,7 +15604,7 @@
           <w:sz w:val="21"/>
           <w:szCs w:val="21"/>
         </w:rPr>
-        <w:t xml:space="preserve">Source or replace the $12,500 rate, and show cost as a range (low / base / high).</w:t>
+        <w:t xml:space="preserve">Add more comparison data (other fields) before testing NPT against production statistically.</w:t>
       </w:r>
     </w:p>
     <w:p>
@@ -15564,25 +15623,6 @@
           <w:sz w:val="21"/>
           <w:szCs w:val="21"/>
         </w:rPr>
-        <w:t xml:space="preserve">Add more comparison data (other fields) before testing NPT against production statistically.</w:t>
-      </w:r>
-    </w:p>
-    <w:p>
-      <w:pPr>
-        <w:pStyle w:val="ListParagraph"/>
-        <w:numPr>
-          <w:ilvl w:val="0"/>
-          <w:numId w:val="2"/>
-        </w:numPr>
-        <w:spacing w:after="70" w:line="276"/>
-      </w:pPr>
-      <w:r>
-        <w:rPr>
-          <w:rFonts w:ascii="Arial" w:cs="Arial" w:eastAsia="Arial" w:hAnsi="Arial"/>
-          <w:color w:val="1B2A33"/>
-          <w:sz w:val="21"/>
-          <w:szCs w:val="21"/>
-        </w:rPr>
         <w:t xml:space="preserve">Mine the narrative text to give root causes inside the large categories, such as which equipment failed.</w:t>
       </w:r>
     </w:p>
@@ -15766,7 +15806,7 @@
           <w:sz w:val="22"/>
           <w:szCs w:val="22"/>
         </w:rPr>
-        <w:t xml:space="preserve">5. Your report shows 20.0% in one place and 20.5% in another. Why?</w:t>
+        <w:t xml:space="preserve">5. Your report once showed 20.0% in one place and 20.5% in another. Why?</w:t>
       </w:r>
     </w:p>
     <w:p>
@@ -15780,7 +15820,7 @@
           <w:sz w:val="21"/>
           <w:szCs w:val="21"/>
         </w:rPr>
-        <w:t xml:space="preserve">Two denominators. The headline divides NPT hours by all logged hours (20.0%). One SQL view divides by hours excluding rig moves (20.5%). I caught it while validating the Power BI measures against the database. The fix is to standardise on one definition, which I chose to be total hours, and note it. Finding the difference during validation is the reason for validating.</w:t>
+        <w:t xml:space="preserve">Two denominators. The headline divided NPT hours by all logged hours (20.0%), while one SQL view divided by hours excluding rig moves (20.5%). I caught it while validating the Power BI measures against the database. I standardised everything on total hours, rebuilt the views, and confirmed the new values matched. Finding the difference during validation is the reason for validating.</w:t>
       </w:r>
     </w:p>
     <w:p>
@@ -15940,7 +15980,7 @@
           <w:sz w:val="21"/>
           <w:szCs w:val="21"/>
         </w:rPr>
-        <w:t xml:space="preserve">Standardise the NPT definition in SQL, source the day rate and show cost as a range, mine the narratives for root causes inside the big categories, and add other fields to test NPT against production with enough wells.</w:t>
+        <w:t xml:space="preserve">Source the day rate and show cost as a range, mine the narratives for root causes inside the big categories, and add other fields to test NPT against production with enough wells.</w:t>
       </w:r>
     </w:p>
     <w:p>

</xml_diff>